<commit_message>
adding some UI design
</commit_message>
<xml_diff>
--- a/Clinic System Decumentation.docx
+++ b/Clinic System Decumentation.docx
@@ -1135,12 +1135,14 @@
         <w:rPr>
           <w:b/>
           <w:bCs/>
-        </w:rPr>
-      </w:pPr>
-      <w:r>
-        <w:rPr>
-          <w:b/>
-          <w:bCs/>
+          <w:highlight w:val="yellow"/>
+        </w:rPr>
+      </w:pPr>
+      <w:r>
+        <w:rPr>
+          <w:b/>
+          <w:bCs/>
+          <w:highlight w:val="yellow"/>
         </w:rPr>
         <w:t>FR-APP-011</w:t>
       </w:r>
@@ -1150,14 +1152,23 @@
         <w:contextualSpacing/>
       </w:pPr>
       <w:r>
+        <w:rPr>
+          <w:highlight w:val="yellow"/>
+        </w:rPr>
         <w:t xml:space="preserve">The system </w:t>
       </w:r>
       <w:proofErr w:type="gramStart"/>
       <w:r>
+        <w:rPr>
+          <w:highlight w:val="yellow"/>
+        </w:rPr>
         <w:t>shall</w:t>
       </w:r>
       <w:proofErr w:type="gramEnd"/>
       <w:r>
+        <w:rPr>
+          <w:highlight w:val="yellow"/>
+        </w:rPr>
         <w:t xml:space="preserve"> prevent users from scheduling an appointment outside the selected doctor's working hours.</w:t>
       </w:r>
     </w:p>
@@ -1239,12 +1250,14 @@
         <w:rPr>
           <w:b/>
           <w:bCs/>
-        </w:rPr>
-      </w:pPr>
-      <w:r>
-        <w:rPr>
-          <w:b/>
-          <w:bCs/>
+          <w:highlight w:val="yellow"/>
+        </w:rPr>
+      </w:pPr>
+      <w:r>
+        <w:rPr>
+          <w:b/>
+          <w:bCs/>
+          <w:highlight w:val="yellow"/>
         </w:rPr>
         <w:t>FR-APP-015</w:t>
       </w:r>
@@ -1253,12 +1266,14 @@
       <w:pPr>
         <w:contextualSpacing/>
         <w:rPr>
+          <w:rFonts w:hint="cs"/>
           <w:rtl/>
-          <w:lang w:val="en-GB"/>
-        </w:rPr>
-      </w:pPr>
-      <w:r>
-        <w:rPr>
+          <w:lang w:bidi="ar-JO"/>
+        </w:rPr>
+      </w:pPr>
+      <w:r>
+        <w:rPr>
+          <w:highlight w:val="yellow"/>
           <w:lang w:val="en-GB"/>
         </w:rPr>
         <w:t>The system shall treat each appointment as a separate patient visit/session with the selected doctor.</w:t>
@@ -1268,13 +1283,15 @@
       <w:pPr>
         <w:contextualSpacing/>
         <w:rPr>
-          <w:lang w:val="en-GB"/>
-        </w:rPr>
-      </w:pPr>
-      <w:r>
-        <w:rPr>
-          <w:b/>
-          <w:bCs/>
+          <w:highlight w:val="yellow"/>
+          <w:lang w:val="en-GB"/>
+        </w:rPr>
+      </w:pPr>
+      <w:r>
+        <w:rPr>
+          <w:b/>
+          <w:bCs/>
+          <w:highlight w:val="yellow"/>
         </w:rPr>
         <w:t>FR-APP-016</w:t>
       </w:r>
@@ -1289,6 +1306,7 @@
       </w:pPr>
       <w:r>
         <w:rPr>
+          <w:highlight w:val="yellow"/>
           <w:lang w:bidi="ar-JO"/>
         </w:rPr>
         <w:t>The system shall allow authorized users to add or update notes for an existing appointment.</w:t>

</xml_diff>